<commit_message>
commit con una herramienta mas de verificacion de SEO agregada en informe
</commit_message>
<xml_diff>
--- a/doc/informe_tecnico_seo.docx
+++ b/doc/informe_tecnico_seo.docx
@@ -30,7 +30,27 @@
           <w:sz w:val="24"/>
           <w:szCs w:val="24"/>
         </w:rPr>
-        <w:t>Trabajo Práctico N° 2 — Desarrollo de Sitios Web</w:t>
+        <w:t xml:space="preserve">Trabajo Práctico </w:t>
+      </w:r>
+      <w:proofErr w:type="spellStart"/>
+      <w:r>
+        <w:rPr>
+          <w:i/>
+          <w:iCs/>
+          <w:sz w:val="24"/>
+          <w:szCs w:val="24"/>
+        </w:rPr>
+        <w:t>N°</w:t>
+      </w:r>
+      <w:proofErr w:type="spellEnd"/>
+      <w:r>
+        <w:rPr>
+          <w:i/>
+          <w:iCs/>
+          <w:sz w:val="24"/>
+          <w:szCs w:val="24"/>
+        </w:rPr>
+        <w:t xml:space="preserve"> 2 — Desarrollo de Sitios Web</w:t>
       </w:r>
     </w:p>
     <w:p>
@@ -71,7 +91,23 @@
         <w:spacing w:after="160"/>
       </w:pPr>
       <w:r>
-        <w:t>El título del sitio (etiqueta &lt;title&gt;) se mantiene como "VNTCuts" en la portada y se diferencia como "Portfolio" en la sección interna, identificando claramente cada página en los resultados de búsqueda y en la pestaña del navegador. No se registraron cambios de dominio respecto del TP1; el sitio se publicará bajo el dominio gratuito provisto por GitHub Pages.</w:t>
+        <w:t>El título del sitio (etiqueta &lt;</w:t>
+      </w:r>
+      <w:proofErr w:type="spellStart"/>
+      <w:r>
+        <w:t>title</w:t>
+      </w:r>
+      <w:proofErr w:type="spellEnd"/>
+      <w:r>
+        <w:t>&gt;) se mantiene como "VNTCuts" en la portada y se diferencia como "</w:t>
+      </w:r>
+      <w:proofErr w:type="gramStart"/>
+      <w:r>
+        <w:t>Portfolio</w:t>
+      </w:r>
+      <w:proofErr w:type="gramEnd"/>
+      <w:r>
+        <w:t>" en la sección interna, identificando claramente cada página en los resultados de búsqueda y en la pestaña del navegador. No se registraron cambios de dominio respecto del TP1; el sitio se publicará bajo el dominio gratuito provisto por GitHub Pages.</w:t>
       </w:r>
     </w:p>
     <w:p>
@@ -208,7 +244,15 @@
               <w:jc w:val="center"/>
             </w:pPr>
             <w:r>
-              <w:t>Presentar VNTCuts y captar la atención del visitante mediante un reel audiovisual y una presentación de la marca.</w:t>
+              <w:t xml:space="preserve">Presentar VNTCuts y captar la atención del visitante mediante un </w:t>
+            </w:r>
+            <w:proofErr w:type="spellStart"/>
+            <w:r>
+              <w:t>reel</w:t>
+            </w:r>
+            <w:proofErr w:type="spellEnd"/>
+            <w:r>
+              <w:t xml:space="preserve"> audiovisual y una presentación de la marca.</w:t>
             </w:r>
           </w:p>
         </w:tc>
@@ -322,7 +366,15 @@
               <w:jc w:val="center"/>
             </w:pPr>
             <w:r>
-              <w:t>trabajos destacados, portfolio, videos</w:t>
+              <w:t xml:space="preserve">trabajos destacados, </w:t>
+            </w:r>
+            <w:proofErr w:type="gramStart"/>
+            <w:r>
+              <w:t>portfolio</w:t>
+            </w:r>
+            <w:proofErr w:type="gramEnd"/>
+            <w:r>
+              <w:t>, videos</w:t>
             </w:r>
           </w:p>
         </w:tc>
@@ -343,9 +395,11 @@
             <w:r>
               <w:br/>
             </w:r>
+            <w:proofErr w:type="gramStart"/>
             <w:r>
               <w:t>Portfolio</w:t>
             </w:r>
+            <w:proofErr w:type="gramEnd"/>
           </w:p>
         </w:tc>
         <w:tc>
@@ -371,8 +425,13 @@
               <w:spacing w:before="200" w:after="200"/>
               <w:jc w:val="center"/>
             </w:pPr>
-            <w:r>
-              <w:t>portfolio, videoclips, publicidad</w:t>
+            <w:proofErr w:type="gramStart"/>
+            <w:r>
+              <w:t>portfolio</w:t>
+            </w:r>
+            <w:proofErr w:type="gramEnd"/>
+            <w:r>
+              <w:t>, videoclips, publicidad</w:t>
             </w:r>
           </w:p>
         </w:tc>
@@ -458,7 +517,71 @@
         <w:spacing w:after="160"/>
       </w:pPr>
       <w:r>
-        <w:t>Ambas páginas del sitio utilizan etiquetas HTML5 semánticas en lugar de divs genéricos: &lt;header&gt; para el encabezado y la navegación, &lt;nav&gt; para el menú principal, &lt;main&gt; para el contenido central, &lt;section&gt; para cada bloque temático (hero, trabajos destacados, servicios, contacto, portfolio) y &lt;footer&gt; para el pie de página. Esto facilita que los motores de búsqueda interpreten correctamente la estructura y jerarquía del contenido.</w:t>
+        <w:t xml:space="preserve">Ambas páginas del sitio utilizan etiquetas HTML5 semánticas en lugar de </w:t>
+      </w:r>
+      <w:proofErr w:type="spellStart"/>
+      <w:r>
+        <w:t>divs</w:t>
+      </w:r>
+      <w:proofErr w:type="spellEnd"/>
+      <w:r>
+        <w:t xml:space="preserve"> genéricos: &lt;</w:t>
+      </w:r>
+      <w:proofErr w:type="spellStart"/>
+      <w:r>
+        <w:t>header</w:t>
+      </w:r>
+      <w:proofErr w:type="spellEnd"/>
+      <w:r>
+        <w:t>&gt; para el encabezado y la navegación, &lt;</w:t>
+      </w:r>
+      <w:proofErr w:type="spellStart"/>
+      <w:r>
+        <w:t>nav</w:t>
+      </w:r>
+      <w:proofErr w:type="spellEnd"/>
+      <w:r>
+        <w:t>&gt; para el menú principal, &lt;</w:t>
+      </w:r>
+      <w:proofErr w:type="spellStart"/>
+      <w:r>
+        <w:t>main</w:t>
+      </w:r>
+      <w:proofErr w:type="spellEnd"/>
+      <w:r>
+        <w:t>&gt; para el contenido central, &lt;</w:t>
+      </w:r>
+      <w:proofErr w:type="spellStart"/>
+      <w:r>
+        <w:t>section</w:t>
+      </w:r>
+      <w:proofErr w:type="spellEnd"/>
+      <w:r>
+        <w:t>&gt; para cada bloque temático (</w:t>
+      </w:r>
+      <w:proofErr w:type="spellStart"/>
+      <w:r>
+        <w:t>hero</w:t>
+      </w:r>
+      <w:proofErr w:type="spellEnd"/>
+      <w:r>
+        <w:t xml:space="preserve">, trabajos destacados, servicios, contacto, </w:t>
+      </w:r>
+      <w:proofErr w:type="gramStart"/>
+      <w:r>
+        <w:t>portfolio</w:t>
+      </w:r>
+      <w:proofErr w:type="gramEnd"/>
+      <w:r>
+        <w:t>) y &lt;</w:t>
+      </w:r>
+      <w:proofErr w:type="spellStart"/>
+      <w:r>
+        <w:t>footer</w:t>
+      </w:r>
+      <w:proofErr w:type="spellEnd"/>
+      <w:r>
+        <w:t>&gt; para el pie de página. Esto facilita que los motores de búsqueda interpreten correctamente la estructura y jerarquía del contenido.</w:t>
       </w:r>
       <w:r>
         <w:br/>
@@ -481,7 +604,23 @@
         <w:spacing w:after="160"/>
       </w:pPr>
       <w:r>
-        <w:t>Se respeta una jerarquía de encabezados sin saltos de nivel. En index.html: un único &lt;h1&gt; ("Edición y postproducción audiovisual profesional"), seguido de &lt;h2&gt; para cada sección ("Trabajos destacados", "Servicios", llamado a la acción de contacto) y &lt;h3&gt; para los títulos de cada tarjeta de trabajo o servicio. En portfolio.html: un único &lt;h1&gt; ("Portfolio"), &lt;h2&gt; para la sección de contacto y &lt;h3&gt; para el título de cada video del portfolio. No se detectaron saltos de jerarquía (por ejemplo, de h1 a h3 sin pasar por h2).</w:t>
+        <w:t>Se respeta una jerarquía de encabezados sin saltos de nivel. En index.html: un único &lt;h1&gt; ("Edición y postproducción audiovisual profesional"), seguido de &lt;h2&gt; para cada sección ("Trabajos destacados", "Servicios", llamado a la acción de contacto) y &lt;h3&gt; para los títulos de cada tarjeta de trabajo o servicio. En portfolio.html: un único &lt;h1&gt; ("</w:t>
+      </w:r>
+      <w:proofErr w:type="gramStart"/>
+      <w:r>
+        <w:t>Portfolio</w:t>
+      </w:r>
+      <w:proofErr w:type="gramEnd"/>
+      <w:r>
+        <w:t xml:space="preserve">"), &lt;h2&gt; para la sección de contacto y &lt;h3&gt; para el título de cada video del </w:t>
+      </w:r>
+      <w:proofErr w:type="gramStart"/>
+      <w:r>
+        <w:t>portfolio</w:t>
+      </w:r>
+      <w:proofErr w:type="gramEnd"/>
+      <w:r>
+        <w:t>. No se detectaron saltos de jerarquía (por ejemplo, de h1 a h3 sin pasar por h2).</w:t>
       </w:r>
       <w:r>
         <w:br/>
@@ -496,76 +635,62 @@
           <w:b/>
           <w:bCs/>
         </w:rPr>
-        <w:t>Atributos alt en imágenes</w:t>
-      </w:r>
-    </w:p>
-    <w:p>
-      <w:pPr>
-        <w:spacing w:after="160"/>
-      </w:pPr>
-      <w:r>
-        <w:t>Las imágenes presentes en el sitio (el logo de VNTCuts, repetido en el header de ambas páginas</w:t>
-      </w:r>
-      <w:r>
-        <w:t xml:space="preserve"> como también las imágenes usadas en las tarjetas de los servicios</w:t>
-      </w:r>
-      <w:r>
-        <w:t>) cuentan con atributo alt descriptivo ("logo VNTCuts</w:t>
-      </w:r>
-      <w:r>
-        <w:t>, Edición de video y Postproducción audiovisual</w:t>
-      </w:r>
-      <w:r>
-        <w:t>"), lo que aporta contexto a los buscadores y mejora la accesibilidad para lectores de pantalla</w:t>
-      </w:r>
-      <w:r>
-        <w:t>.</w:t>
-      </w:r>
-      <w:r>
-        <w:br/>
-      </w:r>
-    </w:p>
-    <w:p>
-      <w:pPr>
-        <w:spacing w:after="160"/>
-      </w:pPr>
+        <w:t xml:space="preserve">Atributos </w:t>
+      </w:r>
+      <w:proofErr w:type="spellStart"/>
       <w:r>
         <w:rPr>
           <w:b/>
           <w:bCs/>
         </w:rPr>
-        <w:t>URLs amigables</w:t>
-      </w:r>
-    </w:p>
-    <w:p>
-      <w:pPr>
-        <w:spacing w:after="160"/>
-      </w:pPr>
-      <w:r>
-        <w:t>El sitio utiliza nombres de archivo simples, descriptivos y en minúsculas (index.html, portfolio.html), sin parámetros ni identificadores numéricos, lo que genera URLs legibles tanto para usuarios como para motores de búsqueda.</w:t>
-      </w:r>
-      <w:r>
-        <w:br/>
-      </w:r>
-    </w:p>
-    <w:p>
-      <w:pPr>
-        <w:spacing w:after="160"/>
-      </w:pPr>
+        <w:t>alt</w:t>
+      </w:r>
+      <w:proofErr w:type="spellEnd"/>
       <w:r>
         <w:rPr>
           <w:b/>
           <w:bCs/>
         </w:rPr>
-        <w:t>Optimización de metadatos</w:t>
-      </w:r>
-    </w:p>
-    <w:p>
-      <w:pPr>
-        <w:spacing w:after="160"/>
-      </w:pPr>
-      <w:r>
-        <w:t>Cada página define su propia etiqueta &lt;title&gt; ("VNTCuts" y "Portfolio" respectivamente) y su propia &lt;meta name="description"&gt;, redactada de forma específica para el contenido de cada página: la portada describe el servicio general de edición y postproducción, mientras que la sección portfolio describe el contenido de trabajos de publicidad y videoclips exhibidos. También se incluye &lt;meta name="viewport"&gt; para garantizar la correcta interpretación en dispositivos móviles, factor que Google considera para el ranking mobile-first.</w:t>
+        <w:t xml:space="preserve"> en imágenes</w:t>
+      </w:r>
+    </w:p>
+    <w:p>
+      <w:pPr>
+        <w:spacing w:after="160"/>
+      </w:pPr>
+      <w:r>
+        <w:t xml:space="preserve">Las imágenes presentes en el sitio (el logo de VNTCuts, repetido en el </w:t>
+      </w:r>
+      <w:proofErr w:type="spellStart"/>
+      <w:r>
+        <w:t>header</w:t>
+      </w:r>
+      <w:proofErr w:type="spellEnd"/>
+      <w:r>
+        <w:t xml:space="preserve"> de ambas páginas</w:t>
+      </w:r>
+      <w:r>
+        <w:t xml:space="preserve"> como también las imágenes usadas en las tarjetas de los servicios</w:t>
+      </w:r>
+      <w:r>
+        <w:t xml:space="preserve">) cuentan con atributo </w:t>
+      </w:r>
+      <w:proofErr w:type="spellStart"/>
+      <w:r>
+        <w:t>alt</w:t>
+      </w:r>
+      <w:proofErr w:type="spellEnd"/>
+      <w:r>
+        <w:t xml:space="preserve"> descriptivo ("logo VNTCuts</w:t>
+      </w:r>
+      <w:r>
+        <w:t>, Edición de video y Postproducción audiovisual</w:t>
+      </w:r>
+      <w:r>
+        <w:t>"), lo que aporta contexto a los buscadores y mejora la accesibilidad para lectores de pantalla</w:t>
+      </w:r>
+      <w:r>
+        <w:t>.</w:t>
       </w:r>
       <w:r>
         <w:br/>
@@ -575,31 +700,206 @@
       <w:pPr>
         <w:spacing w:after="160"/>
       </w:pPr>
+      <w:proofErr w:type="spellStart"/>
       <w:r>
         <w:rPr>
           <w:b/>
           <w:bCs/>
         </w:rPr>
-        <w:t>Uso adecuado de enlaces internos</w:t>
-      </w:r>
-    </w:p>
-    <w:p>
-      <w:pPr>
-        <w:spacing w:after="160"/>
-      </w:pPr>
-      <w:r>
-        <w:t>La navegación principal enlaza de forma consistente entre index.html y portfolio.html, y el botón "Ver portfolio completo" en la portada dirige a la sección de portfolio, reforzando la relación entre páginas. Los enlaces a redes sociales externas (Instagram, YouTube) incluyen los atributos target="_blank" y rel="noopener", evitando vulnerabilidades de seguridad al abrir contenido externo en una nueva pestaña.</w:t>
-      </w:r>
-    </w:p>
-    <w:p>
-      <w:pPr>
-        <w:spacing w:after="160"/>
-      </w:pPr>
+        <w:t>URLs</w:t>
+      </w:r>
+      <w:proofErr w:type="spellEnd"/>
       <w:r>
         <w:rPr>
           <w:b/>
           <w:bCs/>
         </w:rPr>
+        <w:t xml:space="preserve"> amigables</w:t>
+      </w:r>
+    </w:p>
+    <w:p>
+      <w:pPr>
+        <w:spacing w:after="160"/>
+      </w:pPr>
+      <w:r>
+        <w:t xml:space="preserve">El sitio utiliza nombres de archivo simples, descriptivos y en minúsculas (index.html, portfolio.html), sin parámetros ni identificadores numéricos, lo que genera </w:t>
+      </w:r>
+      <w:proofErr w:type="spellStart"/>
+      <w:r>
+        <w:t>URLs</w:t>
+      </w:r>
+      <w:proofErr w:type="spellEnd"/>
+      <w:r>
+        <w:t xml:space="preserve"> legibles tanto para usuarios como para motores de búsqueda.</w:t>
+      </w:r>
+      <w:r>
+        <w:br/>
+      </w:r>
+    </w:p>
+    <w:p>
+      <w:pPr>
+        <w:spacing w:after="160"/>
+      </w:pPr>
+      <w:r>
+        <w:rPr>
+          <w:b/>
+          <w:bCs/>
+        </w:rPr>
+        <w:t>Optimización de metadatos</w:t>
+      </w:r>
+    </w:p>
+    <w:p>
+      <w:pPr>
+        <w:spacing w:after="160"/>
+      </w:pPr>
+      <w:r>
+        <w:t>Cada página define su propia etiqueta &lt;</w:t>
+      </w:r>
+      <w:proofErr w:type="spellStart"/>
+      <w:r>
+        <w:t>title</w:t>
+      </w:r>
+      <w:proofErr w:type="spellEnd"/>
+      <w:r>
+        <w:t>&gt; ("VNTCuts" y "</w:t>
+      </w:r>
+      <w:proofErr w:type="gramStart"/>
+      <w:r>
+        <w:t>Portfolio</w:t>
+      </w:r>
+      <w:proofErr w:type="gramEnd"/>
+      <w:r>
+        <w:t xml:space="preserve">" respectivamente) y su propia &lt;meta </w:t>
+      </w:r>
+      <w:proofErr w:type="spellStart"/>
+      <w:r>
+        <w:t>name</w:t>
+      </w:r>
+      <w:proofErr w:type="spellEnd"/>
+      <w:r>
+        <w:t>="</w:t>
+      </w:r>
+      <w:proofErr w:type="spellStart"/>
+      <w:r>
+        <w:t>description</w:t>
+      </w:r>
+      <w:proofErr w:type="spellEnd"/>
+      <w:r>
+        <w:t xml:space="preserve">"&gt;, redactada de forma específica para el contenido de cada página: la portada describe el servicio general de edición y postproducción, mientras que la sección </w:t>
+      </w:r>
+      <w:proofErr w:type="gramStart"/>
+      <w:r>
+        <w:t>portfolio</w:t>
+      </w:r>
+      <w:proofErr w:type="gramEnd"/>
+      <w:r>
+        <w:t xml:space="preserve"> describe el contenido de trabajos de publicidad y videoclips exhibidos. También se incluye &lt;meta </w:t>
+      </w:r>
+      <w:proofErr w:type="spellStart"/>
+      <w:r>
+        <w:t>name</w:t>
+      </w:r>
+      <w:proofErr w:type="spellEnd"/>
+      <w:r>
+        <w:t>="</w:t>
+      </w:r>
+      <w:proofErr w:type="spellStart"/>
+      <w:r>
+        <w:t>viewport</w:t>
+      </w:r>
+      <w:proofErr w:type="spellEnd"/>
+      <w:r>
+        <w:t xml:space="preserve">"&gt; para garantizar la correcta interpretación en dispositivos móviles, factor que Google considera para el ranking </w:t>
+      </w:r>
+      <w:proofErr w:type="spellStart"/>
+      <w:r>
+        <w:t>mobile-first</w:t>
+      </w:r>
+      <w:proofErr w:type="spellEnd"/>
+      <w:r>
+        <w:t>.</w:t>
+      </w:r>
+      <w:r>
+        <w:br/>
+      </w:r>
+    </w:p>
+    <w:p>
+      <w:pPr>
+        <w:spacing w:after="160"/>
+      </w:pPr>
+      <w:r>
+        <w:rPr>
+          <w:b/>
+          <w:bCs/>
+        </w:rPr>
+        <w:t>Uso adecuado de enlaces internos</w:t>
+      </w:r>
+    </w:p>
+    <w:p>
+      <w:pPr>
+        <w:spacing w:after="160"/>
+      </w:pPr>
+      <w:r>
+        <w:t xml:space="preserve">La navegación principal enlaza de forma consistente entre index.html y portfolio.html, y el botón "Ver </w:t>
+      </w:r>
+      <w:proofErr w:type="gramStart"/>
+      <w:r>
+        <w:t>portfolio</w:t>
+      </w:r>
+      <w:proofErr w:type="gramEnd"/>
+      <w:r>
+        <w:t xml:space="preserve"> completo" en la portada dirige a la sección de </w:t>
+      </w:r>
+      <w:proofErr w:type="gramStart"/>
+      <w:r>
+        <w:t>portfolio</w:t>
+      </w:r>
+      <w:proofErr w:type="gramEnd"/>
+      <w:r>
+        <w:t xml:space="preserve">, reforzando la relación entre páginas. Los enlaces a redes sociales externas (Instagram, YouTube) incluyen los atributos </w:t>
+      </w:r>
+      <w:proofErr w:type="gramStart"/>
+      <w:r>
+        <w:t>target</w:t>
+      </w:r>
+      <w:proofErr w:type="gramEnd"/>
+      <w:r>
+        <w:t>="_</w:t>
+      </w:r>
+      <w:proofErr w:type="spellStart"/>
+      <w:r>
+        <w:t>blank</w:t>
+      </w:r>
+      <w:proofErr w:type="spellEnd"/>
+      <w:r>
+        <w:t xml:space="preserve">" y </w:t>
+      </w:r>
+      <w:proofErr w:type="spellStart"/>
+      <w:r>
+        <w:t>rel</w:t>
+      </w:r>
+      <w:proofErr w:type="spellEnd"/>
+      <w:r>
+        <w:t>="</w:t>
+      </w:r>
+      <w:proofErr w:type="spellStart"/>
+      <w:r>
+        <w:t>noopener</w:t>
+      </w:r>
+      <w:proofErr w:type="spellEnd"/>
+      <w:r>
+        <w:t>", evitando vulnerabilidades de seguridad al abrir contenido externo en una nueva pestaña.</w:t>
+      </w:r>
+    </w:p>
+    <w:p>
+      <w:pPr>
+        <w:spacing w:after="160"/>
+      </w:pPr>
+      <w:r>
+        <w:rPr>
+          <w:b/>
+          <w:bCs/>
+        </w:rPr>
         <w:lastRenderedPageBreak/>
         <w:t>Minimización de código redundante</w:t>
       </w:r>
@@ -609,7 +909,23 @@
         <w:spacing w:after="160"/>
       </w:pPr>
       <w:r>
-        <w:t>Se removieron del código secciones comentadas correspondientes a versiones anteriores de la maquetación (por ejemplo, el header inicial sin Bootstrap y el botón de contacto sin modal), dejando únicamente comentarios explicativos breves que documentan el propósito de bloques específicos (por ejemplo, la explicación de los breakpoints en estilos.css).</w:t>
+        <w:t xml:space="preserve">Se removieron del código secciones comentadas correspondientes a versiones anteriores de la maquetación (por ejemplo, el </w:t>
+      </w:r>
+      <w:proofErr w:type="spellStart"/>
+      <w:r>
+        <w:t>header</w:t>
+      </w:r>
+      <w:proofErr w:type="spellEnd"/>
+      <w:r>
+        <w:t xml:space="preserve"> inicial sin Bootstrap y el botón de contacto sin modal), dejando únicamente comentarios explicativos breves que documentan el propósito de bloques específicos (por ejemplo, la explicación de los </w:t>
+      </w:r>
+      <w:proofErr w:type="spellStart"/>
+      <w:r>
+        <w:t>breakpoints</w:t>
+      </w:r>
+      <w:proofErr w:type="spellEnd"/>
+      <w:r>
+        <w:t xml:space="preserve"> en estilos.css).</w:t>
       </w:r>
     </w:p>
     <w:p>
@@ -629,7 +945,47 @@
         <w:spacing w:after="160"/>
       </w:pPr>
       <w:r>
-        <w:t>Las hojas de estilo se cargan en el &lt;head&gt; (bootstrap-custom.css, Bootstrap Icons vía CDN y estilos.css) para evitar el parpadeo de contenido sin estilos (FOUC), mientras que los scripts de JavaScript (bundle de Bootstrap y scripts propios) se cargan al final del &lt;body&gt;, evitando que bloqueen el renderizado inicial de la página. El theme de Bootstrap se compiló de forma personalizada mediante Sass, lo que permite trabajar sobre un único archivo CSS resultante en lugar de cargar Bootstrap completo más una hoja de overrides separada.</w:t>
+        <w:t xml:space="preserve">Las hojas de estilo se cargan en el &lt;head&gt; (bootstrap-custom.css, Bootstrap </w:t>
+      </w:r>
+      <w:proofErr w:type="spellStart"/>
+      <w:r>
+        <w:t>Icons</w:t>
+      </w:r>
+      <w:proofErr w:type="spellEnd"/>
+      <w:r>
+        <w:t xml:space="preserve"> vía CDN y estilos.css) para evitar el parpadeo de contenido sin estilos (FOUC), mientras que los scripts de JavaScript (</w:t>
+      </w:r>
+      <w:proofErr w:type="spellStart"/>
+      <w:r>
+        <w:t>bundle</w:t>
+      </w:r>
+      <w:proofErr w:type="spellEnd"/>
+      <w:r>
+        <w:t xml:space="preserve"> de Bootstrap y scripts propios) se cargan al final del &lt;</w:t>
+      </w:r>
+      <w:proofErr w:type="spellStart"/>
+      <w:r>
+        <w:t>body</w:t>
+      </w:r>
+      <w:proofErr w:type="spellEnd"/>
+      <w:r>
+        <w:t xml:space="preserve">&gt;, evitando que bloqueen el renderizado inicial de la página. El </w:t>
+      </w:r>
+      <w:proofErr w:type="spellStart"/>
+      <w:r>
+        <w:t>theme</w:t>
+      </w:r>
+      <w:proofErr w:type="spellEnd"/>
+      <w:r>
+        <w:t xml:space="preserve"> de Bootstrap se compiló de forma personalizada mediante Sass, lo que permite trabajar sobre un único archivo CSS resultante en lugar de cargar Bootstrap completo más una hoja de </w:t>
+      </w:r>
+      <w:proofErr w:type="spellStart"/>
+      <w:r>
+        <w:t>overrides</w:t>
+      </w:r>
+      <w:proofErr w:type="spellEnd"/>
+      <w:r>
+        <w:t xml:space="preserve"> separada.</w:t>
       </w:r>
     </w:p>
     <w:p>
@@ -654,7 +1010,35 @@
           <w:b/>
           <w:bCs/>
         </w:rPr>
-        <w:t>Herramienta utilizada para verificar SEO</w:t>
+        <w:t>Herramienta</w:t>
+      </w:r>
+      <w:r>
+        <w:rPr>
+          <w:b/>
+          <w:bCs/>
+        </w:rPr>
+        <w:t>s</w:t>
+      </w:r>
+      <w:r>
+        <w:rPr>
+          <w:b/>
+          <w:bCs/>
+        </w:rPr>
+        <w:t xml:space="preserve"> utilizada</w:t>
+      </w:r>
+      <w:r>
+        <w:rPr>
+          <w:b/>
+          <w:bCs/>
+        </w:rPr>
+        <w:t>s</w:t>
+      </w:r>
+      <w:r>
+        <w:rPr>
+          <w:b/>
+          <w:bCs/>
+        </w:rPr>
+        <w:t xml:space="preserve"> para verificar SEO</w:t>
       </w:r>
     </w:p>
     <w:p>
@@ -748,23 +1132,95 @@
     </w:p>
     <w:p>
       <w:pPr>
-        <w:pStyle w:val="Ttulo2"/>
+        <w:spacing w:after="160"/>
       </w:pPr>
       <w:r>
         <w:lastRenderedPageBreak/>
-        <w:t>Conclusión</w:t>
-      </w:r>
-    </w:p>
-    <w:p>
-      <w:pPr>
-        <w:spacing w:after="160"/>
-      </w:pPr>
-      <w:r>
-        <w:t>El sitio implementa las principales prácticas de SEO on-site recomendadas para un sitio estático informativo: estructura semántica, jerarquía de títulos sin saltos, metadatos diferenciados por página, URLs amigables y organización eficiente de recursos. Las mejoras pendientes identificadas (auditoría con herramientas automatizadas y refuerzo de accesibilidad en contenido audiovisual) quedan propuestas como trabajo futuro una vez publicado el sitio en GitHub Pages.</w:t>
+        <w:t>Y también hice una verificación con WAVE:</w:t>
+      </w:r>
+    </w:p>
+    <w:p>
+      <w:pPr>
+        <w:spacing w:after="160"/>
+      </w:pPr>
+      <w:r>
+        <w:drawing>
+          <wp:inline distT="0" distB="0" distL="0" distR="0" wp14:anchorId="066440F7" wp14:editId="79467D69">
+            <wp:extent cx="6160770" cy="3590925"/>
+            <wp:effectExtent l="0" t="0" r="0" b="9525"/>
+            <wp:docPr id="1392445417" name="Imagen 1"/>
+            <wp:cNvGraphicFramePr>
+              <a:graphicFrameLocks xmlns:a="http://schemas.openxmlformats.org/drawingml/2006/main" noChangeAspect="1"/>
+            </wp:cNvGraphicFramePr>
+            <a:graphic xmlns:a="http://schemas.openxmlformats.org/drawingml/2006/main">
+              <a:graphicData uri="http://schemas.openxmlformats.org/drawingml/2006/picture">
+                <pic:pic xmlns:pic="http://schemas.openxmlformats.org/drawingml/2006/picture">
+                  <pic:nvPicPr>
+                    <pic:cNvPr id="1392445417" name=""/>
+                    <pic:cNvPicPr/>
+                  </pic:nvPicPr>
+                  <pic:blipFill>
+                    <a:blip r:embed="rId8"/>
+                    <a:stretch>
+                      <a:fillRect/>
+                    </a:stretch>
+                  </pic:blipFill>
+                  <pic:spPr>
+                    <a:xfrm>
+                      <a:off x="0" y="0"/>
+                      <a:ext cx="6167746" cy="3594991"/>
+                    </a:xfrm>
+                    <a:prstGeom prst="rect">
+                      <a:avLst/>
+                    </a:prstGeom>
+                  </pic:spPr>
+                </pic:pic>
+              </a:graphicData>
+            </a:graphic>
+          </wp:inline>
+        </w:drawing>
+      </w:r>
+    </w:p>
+    <w:p>
+      <w:pPr>
+        <w:spacing w:after="160"/>
+      </w:pPr>
+    </w:p>
+    <w:p>
+      <w:pPr>
+        <w:spacing w:after="160"/>
+      </w:pPr>
+      <w:r>
+        <w:t>Los errores que detectó se deben a lo siguiente:</w:t>
+      </w:r>
+    </w:p>
+    <w:p>
+      <w:pPr>
+        <w:spacing w:after="160"/>
+      </w:pPr>
+      <w:r>
+        <w:t>“</w:t>
+      </w:r>
+      <w:r>
+        <w:t>Se detectaron dos botones sin texto accesible (</w:t>
+      </w:r>
+      <w:proofErr w:type="spellStart"/>
+      <w:r>
+        <w:t>Empty</w:t>
+      </w:r>
+      <w:proofErr w:type="spellEnd"/>
+      <w:r>
+        <w:t xml:space="preserve"> Button), un aviso de contraste y alertas informativas relacionadas con enlaces redundantes y elementos multimedia.</w:t>
+      </w:r>
+      <w:r>
+        <w:t xml:space="preserve">” </w:t>
+      </w:r>
+      <w:r>
+        <w:t>El sitio presenta una estructura semántica adecuada y un buen nivel general de accesibilidad.</w:t>
       </w:r>
     </w:p>
     <w:sectPr>
-      <w:footerReference w:type="default" r:id="rId8"/>
+      <w:footerReference w:type="default" r:id="rId9"/>
       <w:pgSz w:w="12240" w:h="15840"/>
       <w:pgMar w:top="1440" w:right="1440" w:bottom="1440" w:left="1440" w:header="708" w:footer="708" w:gutter="0"/>
       <w:cols w:space="720"/>
@@ -1640,6 +2096,48 @@
       </w:tblBorders>
     </w:tblPr>
   </w:style>
+  <w:style w:type="paragraph" w:styleId="Encabezado">
+    <w:name w:val="header"/>
+    <w:basedOn w:val="Normal"/>
+    <w:link w:val="EncabezadoCar"/>
+    <w:uiPriority w:val="99"/>
+    <w:unhideWhenUsed/>
+    <w:rsid w:val="00515097"/>
+    <w:pPr>
+      <w:tabs>
+        <w:tab w:val="center" w:pos="4252"/>
+        <w:tab w:val="right" w:pos="8504"/>
+      </w:tabs>
+    </w:pPr>
+  </w:style>
+  <w:style w:type="character" w:customStyle="1" w:styleId="EncabezadoCar">
+    <w:name w:val="Encabezado Car"/>
+    <w:basedOn w:val="Fuentedeprrafopredeter"/>
+    <w:link w:val="Encabezado"/>
+    <w:uiPriority w:val="99"/>
+    <w:rsid w:val="00515097"/>
+  </w:style>
+  <w:style w:type="paragraph" w:styleId="Piedepgina">
+    <w:name w:val="footer"/>
+    <w:basedOn w:val="Normal"/>
+    <w:link w:val="PiedepginaCar"/>
+    <w:uiPriority w:val="99"/>
+    <w:unhideWhenUsed/>
+    <w:rsid w:val="00515097"/>
+    <w:pPr>
+      <w:tabs>
+        <w:tab w:val="center" w:pos="4252"/>
+        <w:tab w:val="right" w:pos="8504"/>
+      </w:tabs>
+    </w:pPr>
+  </w:style>
+  <w:style w:type="character" w:customStyle="1" w:styleId="PiedepginaCar">
+    <w:name w:val="Pie de página Car"/>
+    <w:basedOn w:val="Fuentedeprrafopredeter"/>
+    <w:link w:val="Piedepgina"/>
+    <w:uiPriority w:val="99"/>
+    <w:rsid w:val="00515097"/>
+  </w:style>
 </w:styles>
 </file>
 

</xml_diff>